<commit_message>
docs: update change-list DOCX for 1.7.8.5 live Diary preview Co-authored-by: monkeycode-ai <monkeycode-ai@chaitin.com>
</commit_message>
<xml_diff>
--- a/SNT-Field-Logbook-change-list.docx
+++ b/SNT-Field-Logbook-change-list.docx
@@ -2680,29 +2680,11 @@
       </w:r>
     </w:p>
     <w:p>
-      <w:r>
-        <w:br w:type="page"/>
-      </w:r>
-    </w:p>
-    <w:p>
-      <w:pPr>
-        <w:pStyle w:val="Heading1"/>
-      </w:pPr>
-      <w:r>
-        <w:t>Major changes (beginner-friendly)</w:t>
-      </w:r>
-    </w:p>
-    <w:p>
-      <w:r>
-        <w:t>Only the major changes from the list above, in the same ascending order, explained simply. Each one also says where to find it and how to check it.</w:t>
-      </w:r>
-    </w:p>
-    <w:p>
       <w:pPr>
         <w:pStyle w:val="ListBullet"/>
       </w:pPr>
       <w:r>
-        <w:t>Your diary used to print only two fixed lines for each day: "home to station" and "station to home". Now you can build your own list of travel lines - for example home, station A, station B, home - and each line becomes its own row in the printed Diary and TA Journal.</w:t>
+        <w:t>While entering a daily log with Edit the rows on, a live Diary preview of just that entry appears below the row editor and updates as each leg is changed.</w:t>
       </w:r>
     </w:p>
     <w:p>
@@ -2716,7 +2698,7 @@
         <w:t xml:space="preserve">Where in the app: </w:t>
       </w:r>
       <w:r>
-        <w:t>Daily-log form &gt; Station / Movement &gt; "Edit export rows"; then Reports &gt; Diary / TA Journal export.</w:t>
+        <w:t>Daily-log form &gt; Diary / TA row editor (the "Edit the rows" button, or two-or-more movements which open it automatically).</w:t>
       </w:r>
     </w:p>
     <w:p>
@@ -2730,7 +2712,25 @@
         <w:t xml:space="preserve">How to check: </w:t>
       </w:r>
       <w:r>
-        <w:t>Turn on Edit export rows, add a middle leg with its own From / To and times, and generate the Diary: your custom lines are printed exactly as you set them.</w:t>
+        <w:t>Turn on Edit the rows: a preview table of DATE / TRAIN NO / TIME DEP / TIME ARR / FROM / TO / NATURE OF WORK appears under the editor and changes as you edit a leg; the times, ROAD / train labels and HQ endpoints match the generated Diary PDF and Word.</w:t>
+      </w:r>
+    </w:p>
+    <w:p>
+      <w:r>
+        <w:br w:type="page"/>
+      </w:r>
+    </w:p>
+    <w:p>
+      <w:pPr>
+        <w:pStyle w:val="Heading1"/>
+      </w:pPr>
+      <w:r>
+        <w:t>Major changes (beginner-friendly)</w:t>
+      </w:r>
+    </w:p>
+    <w:p>
+      <w:r>
+        <w:t>Only the major changes from the list above, in the same ascending order, explained simply. Each one also says where to find it and how to check it.</w:t>
       </w:r>
     </w:p>
     <w:p>
@@ -2738,7 +2738,7 @@
         <w:pStyle w:val="ListBullet"/>
       </w:pPr>
       <w:r>
-        <w:t>You can now record a station visit and a footplate ride together in one single daily log - the ride just becomes another stop on that day's journey, and the printed report lists the whole journey in the order you actually travelled it.</w:t>
+        <w:t>Your diary used to print only two fixed lines for each day: "home to station" and "station to home". Now you can build your own list of travel lines - for example home, station A, station B, home - and each line becomes its own row in the printed Diary and TA Journal.</w:t>
       </w:r>
     </w:p>
     <w:p>
@@ -2752,7 +2752,7 @@
         <w:t xml:space="preserve">Where in the app: </w:t>
       </w:r>
       <w:r>
-        <w:t>Daily-log form &gt; "Add another movement"; check in Reports &gt; Diary / TA Journal.</w:t>
+        <w:t>Daily-log form &gt; Station / Movement &gt; "Edit export rows"; then Reports &gt; Diary / TA Journal export.</w:t>
       </w:r>
     </w:p>
     <w:p>
@@ -2766,7 +2766,7 @@
         <w:t xml:space="preserve">How to check: </w:t>
       </w:r>
       <w:r>
-        <w:t>Add a normal station stop, then choose Footplate as the next stop and fill its boarding / other-end / Day / Night / trains: the export shows the road legs plus the footplate legs, one per ride.</w:t>
+        <w:t>Turn on Edit export rows, add a middle leg with its own From / To and times, and generate the Diary: your custom lines are printed exactly as you set them.</w:t>
       </w:r>
     </w:p>
     <w:p>
@@ -2774,7 +2774,7 @@
         <w:pStyle w:val="ListBullet"/>
       </w:pPr>
       <w:r>
-        <w:t>In Reports, you can now tap any line in a list (for example the list of daily logs or of total TA) and the app opens that exact day's entry. Pressing Back takes you straight back to the same list instead of jumping to Home.</w:t>
+        <w:t>You can now record a station visit and a footplate ride together in one single daily log - the ride just becomes another stop on that day's journey, and the printed report lists the whole journey in the order you actually travelled it.</w:t>
       </w:r>
     </w:p>
     <w:p>
@@ -2788,7 +2788,7 @@
         <w:t xml:space="preserve">Where in the app: </w:t>
       </w:r>
       <w:r>
-        <w:t>Reports tab - any list that shows entries.</w:t>
+        <w:t>Daily-log form &gt; "Add another movement"; check in Reports &gt; Diary / TA Journal.</w:t>
       </w:r>
     </w:p>
     <w:p>
@@ -2802,7 +2802,7 @@
         <w:t xml:space="preserve">How to check: </w:t>
       </w:r>
       <w:r>
-        <w:t>Tap a row, read the entry, press Back: you are back on the list you started from.</w:t>
+        <w:t>Add a normal station stop, then choose Footplate as the next stop and fill its boarding / other-end / Day / Night / trains: the export shows the road legs plus the footplate legs, one per ride.</w:t>
       </w:r>
     </w:p>
     <w:p>
@@ -2810,7 +2810,7 @@
         <w:pStyle w:val="ListBullet"/>
       </w:pPr>
       <w:r>
-        <w:t>Some checks must be done on one particular side of a station (for example "towards the ALVARPET side"). The app now remembers each side separately, so finishing one side does not finish the other: each side gets its own "last done" date and its own warning when it is due.</w:t>
+        <w:t>In Reports, you can now tap any line in a list (for example the list of daily logs or of total TA) and the app opens that exact day's entry. Pressing Back takes you straight back to the same list instead of jumping to Home.</w:t>
       </w:r>
     </w:p>
     <w:p>
@@ -2824,7 +2824,7 @@
         <w:t xml:space="preserve">Where in the app: </w:t>
       </w:r>
       <w:r>
-        <w:t>Daily-log form &gt; Tags that ask "towards which side?"; Settings &gt; Notifications; Reports &gt; Inspection Schedule.</w:t>
+        <w:t>Reports tab - any list that shows entries.</w:t>
       </w:r>
     </w:p>
     <w:p>
@@ -2838,7 +2838,7 @@
         <w:t xml:space="preserve">How to check: </w:t>
       </w:r>
       <w:r>
-        <w:t>Do one side on Monday and the other on Friday: in the Inspection Schedule both sides show their own last-done and next-due dates, and each warns on its own count-down.</w:t>
+        <w:t>Tap a row, read the entry, press Back: you are back on the list you started from.</w:t>
       </w:r>
     </w:p>
     <w:p>
@@ -2846,7 +2846,7 @@
         <w:pStyle w:val="ListBullet"/>
       </w:pPr>
       <w:r>
-        <w:t>On Home, a date in the bottom list that has no entry yet shows a blue "No entry - tap to add" line. Tapping that date opens a ready-to-fill form for exactly that date.</w:t>
+        <w:t>Some checks must be done on one particular side of a station (for example "towards the ALVARPET side"). The app now remembers each side separately, so finishing one side does not finish the other: each side gets its own "last done" date and its own warning when it is due.</w:t>
       </w:r>
     </w:p>
     <w:p>
@@ -2860,7 +2860,7 @@
         <w:t xml:space="preserve">Where in the app: </w:t>
       </w:r>
       <w:r>
-        <w:t>Home tab &gt; the date cards in the bottom timeline.</w:t>
+        <w:t>Daily-log form &gt; Tags that ask "towards which side?"; Settings &gt; Notifications; Reports &gt; Inspection Schedule.</w:t>
       </w:r>
     </w:p>
     <w:p>
@@ -2874,7 +2874,7 @@
         <w:t xml:space="preserve">How to check: </w:t>
       </w:r>
       <w:r>
-        <w:t>Tap an empty date card: the Add Daily Log form opens with that date already filled in; saving files the entry on that same date.</w:t>
+        <w:t>Do one side on Monday and the other on Friday: in the Inspection Schedule both sides show their own last-done and next-due dates, and each warns on its own count-down.</w:t>
       </w:r>
     </w:p>
     <w:p>
@@ -2882,7 +2882,7 @@
         <w:pStyle w:val="ListBullet"/>
       </w:pPr>
       <w:r>
-        <w:t>In the personal build you can ask your AI model to make a printed report prettier: it picks the colours, column widths, row shading and borders for Colour PDF / Word reports. If the AI cannot be reached, the report simply prints in the normal standard look, so nothing ever fails.</w:t>
+        <w:t>On Home, a date in the bottom list that has no entry yet shows a blue "No entry - tap to add" line. Tapping that date opens a ready-to-fill form for exactly that date.</w:t>
       </w:r>
     </w:p>
     <w:p>
@@ -2896,7 +2896,7 @@
         <w:t xml:space="preserve">Where in the app: </w:t>
       </w:r>
       <w:r>
-        <w:t>Settings &gt; AI Export tab (personal build).</w:t>
+        <w:t>Home tab &gt; the date cards in the bottom timeline.</w:t>
       </w:r>
     </w:p>
     <w:p>
@@ -2910,7 +2910,7 @@
         <w:t xml:space="preserve">How to check: </w:t>
       </w:r>
       <w:r>
-        <w:t>Turn the switch on, test the connection, then generate a Colour PDF: the layout looks AI-styled. Turn the AI off (or break the connection) and the same report falls back to the standard look.</w:t>
+        <w:t>Tap an empty date card: the Add Daily Log form opens with that date already filled in; saving files the entry on that same date.</w:t>
       </w:r>
     </w:p>
     <w:p>
@@ -2918,7 +2918,7 @@
         <w:pStyle w:val="ListBullet"/>
       </w:pPr>
       <w:r>
-        <w:t>When logging a move to a station you rarely visit, you can type that station's name just for this one day instead of adding it permanently to your stations list - it shows in the log and the printed reports, but your saved list stays clean.</w:t>
+        <w:t>In the personal build you can ask your AI model to make a printed report prettier: it picks the colours, column widths, row shading and borders for Colour PDF / Word reports. If the AI cannot be reached, the report simply prints in the normal standard look, so nothing ever fails.</w:t>
       </w:r>
     </w:p>
     <w:p>
@@ -2932,7 +2932,7 @@
         <w:t xml:space="preserve">Where in the app: </w:t>
       </w:r>
       <w:r>
-        <w:t>Daily-log form &gt; Station / Movement &gt; "Temporary station...".</w:t>
+        <w:t>Settings &gt; AI Export tab (personal build).</w:t>
       </w:r>
     </w:p>
     <w:p>
@@ -2946,7 +2946,7 @@
         <w:t xml:space="preserve">How to check: </w:t>
       </w:r>
       <w:r>
-        <w:t>Type a one-day station name and save: it reappears when you open the log and shows in Home / Reports / print, but Settings &gt; Stations has no new entry.</w:t>
+        <w:t>Turn the switch on, test the connection, then generate a Colour PDF: the layout looks AI-styled. Turn the AI off (or break the connection) and the same report falls back to the standard look.</w:t>
       </w:r>
     </w:p>
     <w:p>
@@ -2954,7 +2954,7 @@
         <w:pStyle w:val="ListBullet"/>
       </w:pPr>
       <w:r>
-        <w:t>On days that repeat a previous day's work, you can copy an entire daily log to one or more other dates in a few taps - same movement, same work, same timings, tags and photos - and edit each copy separately.</w:t>
+        <w:t>When logging a move to a station you rarely visit, you can type that station's name just for this one day instead of adding it permanently to your stations list - it shows in the log and the printed reports, but your saved list stays clean.</w:t>
       </w:r>
     </w:p>
     <w:p>
@@ -2968,7 +2968,7 @@
         <w:t xml:space="preserve">Where in the app: </w:t>
       </w:r>
       <w:r>
-        <w:t>Open any daily log &gt; "Copy to dates" button.</w:t>
+        <w:t>Daily-log form &gt; Station / Movement &gt; "Temporary station...".</w:t>
       </w:r>
     </w:p>
     <w:p>
@@ -2982,7 +2982,7 @@
         <w:t xml:space="preserve">How to check: </w:t>
       </w:r>
       <w:r>
-        <w:t>Tap Copy to dates, pick the new dates on the month grid: each picked date gets its own copy of the entry; the original stays untouched.</w:t>
+        <w:t>Type a one-day station name and save: it reappears when you open the log and shows in Home / Reports / print, but Settings &gt; Stations has no new entry.</w:t>
       </w:r>
     </w:p>
     <w:p>
@@ -2990,7 +2990,7 @@
         <w:pStyle w:val="ListBullet"/>
       </w:pPr>
       <w:r>
-        <w:t>If one day's PCDO visit covered more than one station, you can now add one card per station to the same daily log - each with its own special work, disconnections and counter resets - instead of mixing everything under one station.</w:t>
+        <w:t>On days that repeat a previous day's work, you can copy an entire daily log to one or more other dates in a few taps - same movement, same work, same timings, tags and photos - and edit each copy separately.</w:t>
       </w:r>
     </w:p>
     <w:p>
@@ -3004,7 +3004,7 @@
         <w:t xml:space="preserve">Where in the app: </w:t>
       </w:r>
       <w:r>
-        <w:t>Daily-log form &gt; tick PCDO &gt; "+ Add station".</w:t>
+        <w:t>Open any daily log &gt; "Copy to dates" button.</w:t>
       </w:r>
     </w:p>
     <w:p>
@@ -3018,7 +3018,7 @@
         <w:t xml:space="preserve">How to check: </w:t>
       </w:r>
       <w:r>
-        <w:t>Fill the first station's card, tap + Add station, fill the second: the PCDO export and Reports group each card under its own station.</w:t>
+        <w:t>Tap Copy to dates, pick the new dates on the month grid: each picked date gets its own copy of the entry; the original stays untouched.</w:t>
       </w:r>
     </w:p>
     <w:p>
@@ -3026,7 +3026,7 @@
         <w:pStyle w:val="ListBullet"/>
       </w:pPr>
       <w:r>
-        <w:t>You can choose the letter style of the whole app - for example a handwritten or a book-style face - and the choice works without internet and survives backups.</w:t>
+        <w:t>If one day's PCDO visit covered more than one station, you can now add one card per station to the same daily log - each with its own special work, disconnections and counter resets - instead of mixing everything under one station.</w:t>
       </w:r>
     </w:p>
     <w:p>
@@ -3040,7 +3040,7 @@
         <w:t xml:space="preserve">Where in the app: </w:t>
       </w:r>
       <w:r>
-        <w:t>Settings &gt; Appearance &gt; Font style.</w:t>
+        <w:t>Daily-log form &gt; tick PCDO &gt; "+ Add station".</w:t>
       </w:r>
     </w:p>
     <w:p>
@@ -3054,7 +3054,7 @@
         <w:t xml:space="preserve">How to check: </w:t>
       </w:r>
       <w:r>
-        <w:t>Pick one of the seven faces (System, Delius, Patrick Hand, Nunito, Caveat, Atkinson, Literata): the whole app immediately re-renders in that font.</w:t>
+        <w:t>Fill the first station's card, tap + Add station, fill the second: the PCDO export and Reports group each card under its own station.</w:t>
       </w:r>
     </w:p>
     <w:p>
@@ -3062,7 +3062,7 @@
         <w:pStyle w:val="ListBullet"/>
       </w:pPr>
       <w:r>
-        <w:t>The Home calendar was rebuilt: you can swipe smoothly between months - the next month visibly slides in - with rounded day cells, a blue gradient for today, a green gradient for selected dates, and a spring-back effect when you do not swipe far enough.</w:t>
+        <w:t>You can choose the letter style of the whole app - for example a handwritten or a book-style face - and the choice works without internet and survives backups.</w:t>
       </w:r>
     </w:p>
     <w:p>
@@ -3076,7 +3076,7 @@
         <w:t xml:space="preserve">Where in the app: </w:t>
       </w:r>
       <w:r>
-        <w:t>Home tab &gt; calendar above the daily-log cards.</w:t>
+        <w:t>Settings &gt; Appearance &gt; Font style.</w:t>
       </w:r>
     </w:p>
     <w:p>
@@ -3090,7 +3090,7 @@
         <w:t xml:space="preserve">How to check: </w:t>
       </w:r>
       <w:r>
-        <w:t>Swipe left / right: months slide in smoothly; a weak swipe springs back to the middle month; today is a blue gradient and selected days are green.</w:t>
+        <w:t>Pick one of the seven faces (System, Delius, Patrick Hand, Nunito, Caveat, Atkinson, Literata): the whole app immediately re-renders in that font.</w:t>
       </w:r>
     </w:p>
     <w:p>
@@ -3098,7 +3098,7 @@
         <w:pStyle w:val="ListBullet"/>
       </w:pPr>
       <w:r>
-        <w:t>The Attachments screen got the same modern card look as Notes and Home; the About page now calls the Telegram / WhatsApp links "S&amp;T manuals groups"; and Appearance gained three new colour themes (Forest, Midnight, Rose) and three new fonts (Lexend, IBM Plex, Merriweather).</w:t>
+        <w:t>The Home calendar was rebuilt: you can swipe smoothly between months - the next month visibly slides in - with rounded day cells, a blue gradient for today, a green gradient for selected dates, and a spring-back effect when you do not swipe far enough.</w:t>
       </w:r>
     </w:p>
     <w:p>
@@ -3112,7 +3112,7 @@
         <w:t xml:space="preserve">Where in the app: </w:t>
       </w:r>
       <w:r>
-        <w:t>Attachments tab; Settings &gt; About; Settings &gt; Appearance.</w:t>
+        <w:t>Home tab &gt; calendar above the daily-log cards.</w:t>
       </w:r>
     </w:p>
     <w:p>
@@ -3126,7 +3126,7 @@
         <w:t xml:space="preserve">How to check: </w:t>
       </w:r>
       <w:r>
-        <w:t>Open Attachments to see the new search bar, filter chips and striped cards; read the About groups for the manuals wording; pick a new theme or font in Appearance and watch the app re-skin.</w:t>
+        <w:t>Swipe left / right: months slide in smoothly; a weak swipe springs back to the middle month; today is a blue gradient and selected days are green.</w:t>
       </w:r>
     </w:p>
     <w:p>
@@ -3134,7 +3134,7 @@
         <w:pStyle w:val="ListBullet"/>
       </w:pPr>
       <w:r>
-        <w:t>Appearance gained eight new colour themes - Butter, Champagne, Dragonfruit, Spark, Ultra, Vanilla, Neon and Lilac. Each theme is a colour pair for the whole app, so picking one instantly re-skins everything while buttons, chips and labels stay easy to read.</w:t>
+        <w:t>The Attachments screen got the same modern card look as Notes and Home; the About page now calls the Telegram / WhatsApp links "S&amp;T manuals groups"; and Appearance gained three new colour themes (Forest, Midnight, Rose) and three new fonts (Lexend, IBM Plex, Merriweather).</w:t>
       </w:r>
     </w:p>
     <w:p>
@@ -3148,7 +3148,7 @@
         <w:t xml:space="preserve">Where in the app: </w:t>
       </w:r>
       <w:r>
-        <w:t>Settings &gt; Appearance &gt; Themes.</w:t>
+        <w:t>Attachments tab; Settings &gt; About; Settings &gt; Appearance.</w:t>
       </w:r>
     </w:p>
     <w:p>
@@ -3162,7 +3162,7 @@
         <w:t xml:space="preserve">How to check: </w:t>
       </w:r>
       <w:r>
-        <w:t>Pick a new theme, say Neon: the app's colours change everywhere at once, and the status tints and text stay readable on top of it.</w:t>
+        <w:t>Open Attachments to see the new search bar, filter chips and striped cards; read the About groups for the manuals wording; pick a new theme or font in Appearance and watch the app re-skin.</w:t>
       </w:r>
     </w:p>
     <w:p>
@@ -3170,7 +3170,7 @@
         <w:pStyle w:val="ListBullet"/>
       </w:pPr>
       <w:r>
-        <w:t>Printed colour reports - PDF or Word, every report type - now share one modern look: dark indigo title bands and table headers with white text, a teal accent line, softly striped rows and a tinted Total row. If you prefer the plain (no colour) or Excel reports, those look exactly as before.</w:t>
+        <w:t>Appearance gained eight new colour themes - Butter, Champagne, Dragonfruit, Spark, Ultra, Vanilla, Neon and Lilac. Each theme is a colour pair for the whole app, so picking one instantly re-skins everything while buttons, chips and labels stay easy to read.</w:t>
       </w:r>
     </w:p>
     <w:p>
@@ -3184,7 +3184,7 @@
         <w:t xml:space="preserve">Where in the app: </w:t>
       </w:r>
       <w:r>
-        <w:t>Reports &gt; Generate, the Colour PDF / Word options.</w:t>
+        <w:t>Settings &gt; Appearance &gt; Themes.</w:t>
       </w:r>
     </w:p>
     <w:p>
@@ -3198,7 +3198,7 @@
         <w:t xml:space="preserve">How to check: </w:t>
       </w:r>
       <w:r>
-        <w:t>Generate any colour report: the heading band is deep indigo with white text, a teal rule sits under it, rows alternate softly and the Total row is tinted. Plain and Excel exports are untouched.</w:t>
+        <w:t>Pick a new theme, say Neon: the app's colours change everywhere at once, and the status tints and text stay readable on top of it.</w:t>
       </w:r>
     </w:p>
     <w:p>
@@ -3206,7 +3206,7 @@
         <w:pStyle w:val="ListBullet"/>
       </w:pPr>
       <w:r>
-        <w:t>The app got a subtle 3-D polish: the main buttons and tiles now sit raised with a soft shadow in every theme, the Home calendar casts a little ledge shadow over the list below, and the calendar's green highlight now lines up exactly with the list you are scrolling - on any date, month or screen size.</w:t>
+        <w:t>Printed colour reports - PDF or Word, every report type - now share one modern look: dark indigo title bands and table headers with white text, a teal accent line, softly striped rows and a tinted Total row. If you prefer the plain (no colour) or Excel reports, those look exactly as before.</w:t>
       </w:r>
     </w:p>
     <w:p>
@@ -3220,7 +3220,7 @@
         <w:t xml:space="preserve">Where in the app: </w:t>
       </w:r>
       <w:r>
-        <w:t>Home tab: the calendar and the timeline under it; the raised tiles in Reports, Settings, Tasks, Attachments and Search.</w:t>
+        <w:t>Reports &gt; Generate, the Colour PDF / Word options.</w:t>
       </w:r>
     </w:p>
     <w:p>
@@ -3234,7 +3234,79 @@
         <w:t xml:space="preserve">How to check: </w:t>
       </w:r>
       <w:r>
+        <w:t>Generate any colour report: the heading band is deep indigo with white text, a teal rule sits under it, rows alternate softly and the Total row is tinted. Plain and Excel exports are untouched.</w:t>
+      </w:r>
+    </w:p>
+    <w:p>
+      <w:pPr>
+        <w:pStyle w:val="ListBullet"/>
+      </w:pPr>
+      <w:r>
+        <w:t>The app got a subtle 3-D polish: the main buttons and tiles now sit raised with a soft shadow in every theme, the Home calendar casts a little ledge shadow over the list below, and the calendar's green highlight now lines up exactly with the list you are scrolling - on any date, month or screen size.</w:t>
+      </w:r>
+    </w:p>
+    <w:p>
+      <w:pPr>
+        <w:pStyle w:val="ListBullet2"/>
+      </w:pPr>
+      <w:r>
+        <w:rPr>
+          <w:b/>
+        </w:rPr>
+        <w:t xml:space="preserve">Where in the app: </w:t>
+      </w:r>
+      <w:r>
+        <w:t>Home tab: the calendar and the timeline under it; the raised tiles in Reports, Settings, Tasks, Attachments and Search.</w:t>
+      </w:r>
+    </w:p>
+    <w:p>
+      <w:pPr>
+        <w:pStyle w:val="ListBullet2"/>
+      </w:pPr>
+      <w:r>
+        <w:rPr>
+          <w:b/>
+        </w:rPr>
+        <w:t xml:space="preserve">How to check: </w:t>
+      </w:r>
+      <w:r>
         <w:t>Scroll the Home list slowly: the green highlight on the calendar switches from the upper log card to the lower one exactly when the calendar's bottom edge crosses the middle of the gap between the two cards; Today and the selected buttons sit raised with a shadow.</w:t>
+      </w:r>
+    </w:p>
+    <w:p>
+      <w:pPr>
+        <w:pStyle w:val="ListBullet"/>
+      </w:pPr>
+      <w:r>
+        <w:t>While you are filling in a daily log and have turned on Edit the rows, a live Diary preview of just that day's entry now sits under the editor. It shows the DATE / TRAIN NO / TIME DEP / TIME ARR / FROM / TO / NATURE OF WORK lines exactly as they will print, and it updates as you change each travel line - so you can see the printed look before you generate the report.</w:t>
+      </w:r>
+    </w:p>
+    <w:p>
+      <w:pPr>
+        <w:pStyle w:val="ListBullet2"/>
+      </w:pPr>
+      <w:r>
+        <w:rPr>
+          <w:b/>
+        </w:rPr>
+        <w:t xml:space="preserve">Where in the app: </w:t>
+      </w:r>
+      <w:r>
+        <w:t>Daily-log form &gt; "Edit the rows" (or two-or-more movements, which open the editor automatically).</w:t>
+      </w:r>
+    </w:p>
+    <w:p>
+      <w:pPr>
+        <w:pStyle w:val="ListBullet2"/>
+      </w:pPr>
+      <w:r>
+        <w:rPr>
+          <w:b/>
+        </w:rPr>
+        <w:t xml:space="preserve">How to check: </w:t>
+      </w:r>
+      <w:r>
+        <w:t>Open a daily log, turn on Edit the rows, change a From / To or a time: the preview table under the editor updates at once, and those same values appear in the generated Diary PDF / Word.</w:t>
       </w:r>
     </w:p>
     <w:sectPr>

</xml_diff>

<commit_message>
docs: update change-list DOCX for 1.7.8.6-1.7.8.11 (muster export, temp stations in search) Co-authored-by: monkeycode-ai <monkeycode-ai@chaitin.com>
</commit_message>
<xml_diff>
--- a/SNT-Field-Logbook-change-list.docx
+++ b/SNT-Field-Logbook-change-list.docx
@@ -2716,29 +2716,11 @@
       </w:r>
     </w:p>
     <w:p>
-      <w:r>
-        <w:br w:type="page"/>
-      </w:r>
-    </w:p>
-    <w:p>
-      <w:pPr>
-        <w:pStyle w:val="Heading1"/>
-      </w:pPr>
-      <w:r>
-        <w:t>Major changes (beginner-friendly)</w:t>
-      </w:r>
-    </w:p>
-    <w:p>
-      <w:r>
-        <w:t>Only the major changes from the list above, in the same ascending order, explained simply. Each one also says where to find it and how to check it.</w:t>
-      </w:r>
-    </w:p>
-    <w:p>
       <w:pPr>
         <w:pStyle w:val="ListBullet"/>
       </w:pPr>
       <w:r>
-        <w:t>Your diary used to print only two fixed lines for each day: "home to station" and "station to home". Now you can build your own list of travel lines - for example home, station A, station B, home - and each line becomes its own row in the printed Diary and TA Journal.</w:t>
+        <w:t>A Muster (attendance sheet) export was added: it builds the month's attendance sheet from your daily logs, running from the 11th of the chosen month to the 10th of the next, printed as the two half-rows of days with AMC NO / DMC NO columns and the designation signature line.</w:t>
       </w:r>
     </w:p>
     <w:p>
@@ -2752,7 +2734,7 @@
         <w:t xml:space="preserve">Where in the app: </w:t>
       </w:r>
       <w:r>
-        <w:t>Daily-log form &gt; Station / Movement &gt; "Edit export rows"; then Reports &gt; Diary / TA Journal export.</w:t>
+        <w:t>Reports &gt; Generate Reports (or the top-bar Export menu) &gt; Export Muster; also Settings &gt; My Profile for the new Office field.</w:t>
       </w:r>
     </w:p>
     <w:p>
@@ -2766,7 +2748,7 @@
         <w:t xml:space="preserve">How to check: </w:t>
       </w:r>
       <w:r>
-        <w:t>Turn on Edit export rows, add a middle leg with its own From / To and times, and generate the Diary: your custom lines are printed exactly as you set them.</w:t>
+        <w:t>Pick a muster month and export: each day shows its code - OL for days with a TA-claimed movement, P for other logged days, REST / NH / CR from those entries, PL / CL / SICK from leave - and days with no daily log stay blank; the header prints your zone, Office, PF No, name and designation with the HQ station.</w:t>
       </w:r>
     </w:p>
     <w:p>
@@ -2774,7 +2756,7 @@
         <w:pStyle w:val="ListBullet"/>
       </w:pPr>
       <w:r>
-        <w:t>You can now record a station visit and a footplate ride together in one single daily log - the ride just becomes another stop on that day's journey, and the printed report lists the whole journey in the order you actually travelled it.</w:t>
+        <w:t>The muster sheet now prints landscape and fills about 70-80% of the page, centred; attendance codes print vertically (one letter under the other) and the absence codes (REST, NH, CR and every leave kind) print in red while P and OL stay black.</w:t>
       </w:r>
     </w:p>
     <w:p>
@@ -2788,7 +2770,7 @@
         <w:t xml:space="preserve">Where in the app: </w:t>
       </w:r>
       <w:r>
-        <w:t>Daily-log form &gt; "Add another movement"; check in Reports &gt; Diary / TA Journal.</w:t>
+        <w:t>Reports &gt; Generate Reports &gt; Export Muster (PDF or Word).</w:t>
       </w:r>
     </w:p>
     <w:p>
@@ -2802,7 +2784,7 @@
         <w:t xml:space="preserve">How to check: </w:t>
       </w:r>
       <w:r>
-        <w:t>Add a normal station stop, then choose Footplate as the next stop and fill its boarding / other-end / Day / Night / trains: the export shows the road legs plus the footplate legs, one per ride.</w:t>
+        <w:t>Export the muster as a PDF: the page is landscape, the sheet sits centred, each day's code reads top-to-bottom in its column, and REST / NH / CR / leave codes are red.</w:t>
       </w:r>
     </w:p>
     <w:p>
@@ -2810,7 +2792,7 @@
         <w:pStyle w:val="ListBullet"/>
       </w:pPr>
       <w:r>
-        <w:t>In Reports, you can now tap any line in a list (for example the list of daily logs or of total TA) and the app opens that exact day's entry. Pressing Back takes you straight back to the same list instead of jumping to Home.</w:t>
+        <w:t>The muster table was widened to fill the printable width of the landscape page (about 94%) in PDF and Word, the header font starts larger, the AMC NO / DMC NO columns run wider than the day columns, and the signature designation line right-aligns inside the table edge.</w:t>
       </w:r>
     </w:p>
     <w:p>
@@ -2824,7 +2806,7 @@
         <w:t xml:space="preserve">Where in the app: </w:t>
       </w:r>
       <w:r>
-        <w:t>Reports tab - any list that shows entries.</w:t>
+        <w:t>Reports &gt; Generate Reports &gt; Export Muster (PDF or Word).</w:t>
       </w:r>
     </w:p>
     <w:p>
@@ -2838,7 +2820,7 @@
         <w:t xml:space="preserve">How to check: </w:t>
       </w:r>
       <w:r>
-        <w:t>Tap a row, read the entry, press Back: you are back on the list you started from.</w:t>
+        <w:t>Export the muster: the sheet stretches almost to the page's printable edges, the header stays on one line, AMC / NO wraps cleanly in its wider column, and the designation signature line ends flush with the table's right edge.</w:t>
       </w:r>
     </w:p>
     <w:p>
@@ -2846,7 +2828,7 @@
         <w:pStyle w:val="ListBullet"/>
       </w:pPr>
       <w:r>
-        <w:t>Some checks must be done on one particular side of a station (for example "towards the ALVARPET side"). The app now remembers each side separately, so finishing one side does not finish the other: each side gets its own "last done" date and its own warning when it is due.</w:t>
+        <w:t>Search's All Stations dropdown now lists every temporary station typed on a daily log (the one-off "Temporary station..." names) under a separate group, alphabetically, so entries at those stations can be filtered too.</w:t>
       </w:r>
     </w:p>
     <w:p>
@@ -2860,7 +2842,7 @@
         <w:t xml:space="preserve">Where in the app: </w:t>
       </w:r>
       <w:r>
-        <w:t>Daily-log form &gt; Tags that ask "towards which side?"; Settings &gt; Notifications; Reports &gt; Inspection Schedule.</w:t>
+        <w:t>Search tab &gt; the All Stations dropdown.</w:t>
       </w:r>
     </w:p>
     <w:p>
@@ -2874,7 +2856,7 @@
         <w:t xml:space="preserve">How to check: </w:t>
       </w:r>
       <w:r>
-        <w:t>Do one side on Monday and the other on Friday: in the Inspection Schedule both sides show their own last-done and next-due dates, and each warns on its own count-down.</w:t>
+        <w:t>Log a day at a temporary station, then open Search and tap All Stations: the typed name appears in the "— Temporary stations —" group; picking it narrows the results to that day's log, while Deficiency / Planned Work / Note / Material results are unaffected.</w:t>
       </w:r>
     </w:p>
     <w:p>
@@ -2882,7 +2864,7 @@
         <w:pStyle w:val="ListBullet"/>
       </w:pPr>
       <w:r>
-        <w:t>On Home, a date in the bottom list that has no entry yet shows a blue "No entry - tap to add" line. Tapping that date opens a ready-to-fill form for exactly that date.</w:t>
+        <w:t>The muster PDF sheet now matches the office sample's vertical layout: it starts about a third of the page down, leaving blank header space above for the file header / stamp, and every row grows taller with the attendance-code row as a tall band, while still fitting on one page.</w:t>
       </w:r>
     </w:p>
     <w:p>
@@ -2896,7 +2878,7 @@
         <w:t xml:space="preserve">Where in the app: </w:t>
       </w:r>
       <w:r>
-        <w:t>Home tab &gt; the date cards in the bottom timeline.</w:t>
+        <w:t>Reports &gt; Generate Reports &gt; Export Muster (PDF).</w:t>
       </w:r>
     </w:p>
     <w:p>
@@ -2910,7 +2892,7 @@
         <w:t xml:space="preserve">How to check: </w:t>
       </w:r>
       <w:r>
-        <w:t>Tap an empty date card: the Add Daily Log form opens with that date already filled in; saving files the entry on that same date.</w:t>
+        <w:t>Export the muster as a PDF: blank space sits above the sheet instead of it hugging the top edge, each row is visibly taller than its text, the attendance-code row forms one tall band, and the export is still a single page.</w:t>
       </w:r>
     </w:p>
     <w:p>
@@ -2918,7 +2900,7 @@
         <w:pStyle w:val="ListBullet"/>
       </w:pPr>
       <w:r>
-        <w:t>In the personal build you can ask your AI model to make a printed report prettier: it picks the colours, column widths, row shading and borders for Colour PDF / Word reports. If the AI cannot be reached, the report simply prints in the normal standard look, so nothing ever fails.</w:t>
+        <w:t>The muster file is now named after the designation and the two muster months (for example JE_SIG_JMDG_SEP_OCT for a JE / SIG / JMDG designation, falling back to MUSTER_SEP_OCT), the export picker shows the full period ("September - October 2026") instead of one month, and the printed sheet sits exactly centred on the page.</w:t>
       </w:r>
     </w:p>
     <w:p>
@@ -2932,7 +2914,7 @@
         <w:t xml:space="preserve">Where in the app: </w:t>
       </w:r>
       <w:r>
-        <w:t>Settings &gt; AI Export tab (personal build).</w:t>
+        <w:t>Reports &gt; Generate Reports &gt; Export Muster (PDF, Word or Excel).</w:t>
       </w:r>
     </w:p>
     <w:p>
@@ -2946,7 +2928,25 @@
         <w:t xml:space="preserve">How to check: </w:t>
       </w:r>
       <w:r>
-        <w:t>Turn the switch on, test the connection, then generate a Colour PDF: the layout looks AI-styled. Turn the AI off (or break the connection) and the same report falls back to the standard look.</w:t>
+        <w:t>Export the muster for a September - October period with a designation set in My Profile: the saved file is named JE_SIG_JMDG_SEP_OCT (or MUSTER_SEP_OCT without a designation), the picker's label reads "September - October 2026", and the sheet has equal space above and below with symmetric side margins.</w:t>
+      </w:r>
+    </w:p>
+    <w:p>
+      <w:r>
+        <w:br w:type="page"/>
+      </w:r>
+    </w:p>
+    <w:p>
+      <w:pPr>
+        <w:pStyle w:val="Heading1"/>
+      </w:pPr>
+      <w:r>
+        <w:t>Major changes (beginner-friendly)</w:t>
+      </w:r>
+    </w:p>
+    <w:p>
+      <w:r>
+        <w:t>Only the major changes from the list above, in the same ascending order, explained simply. Each one also says where to find it and how to check it.</w:t>
       </w:r>
     </w:p>
     <w:p>
@@ -2954,7 +2954,7 @@
         <w:pStyle w:val="ListBullet"/>
       </w:pPr>
       <w:r>
-        <w:t>When logging a move to a station you rarely visit, you can type that station's name just for this one day instead of adding it permanently to your stations list - it shows in the log and the printed reports, but your saved list stays clean.</w:t>
+        <w:t>Your diary used to print only two fixed lines for each day: "home to station" and "station to home". Now you can build your own list of travel lines - for example home, station A, station B, home - and each line becomes its own row in the printed Diary and TA Journal.</w:t>
       </w:r>
     </w:p>
     <w:p>
@@ -2968,7 +2968,7 @@
         <w:t xml:space="preserve">Where in the app: </w:t>
       </w:r>
       <w:r>
-        <w:t>Daily-log form &gt; Station / Movement &gt; "Temporary station...".</w:t>
+        <w:t>Daily-log form &gt; Station / Movement &gt; "Edit export rows"; then Reports &gt; Diary / TA Journal export.</w:t>
       </w:r>
     </w:p>
     <w:p>
@@ -2982,7 +2982,7 @@
         <w:t xml:space="preserve">How to check: </w:t>
       </w:r>
       <w:r>
-        <w:t>Type a one-day station name and save: it reappears when you open the log and shows in Home / Reports / print, but Settings &gt; Stations has no new entry.</w:t>
+        <w:t>Turn on Edit export rows, add a middle leg with its own From / To and times, and generate the Diary: your custom lines are printed exactly as you set them.</w:t>
       </w:r>
     </w:p>
     <w:p>
@@ -2990,7 +2990,7 @@
         <w:pStyle w:val="ListBullet"/>
       </w:pPr>
       <w:r>
-        <w:t>On days that repeat a previous day's work, you can copy an entire daily log to one or more other dates in a few taps - same movement, same work, same timings, tags and photos - and edit each copy separately.</w:t>
+        <w:t>You can now record a station visit and a footplate ride together in one single daily log - the ride just becomes another stop on that day's journey, and the printed report lists the whole journey in the order you actually travelled it.</w:t>
       </w:r>
     </w:p>
     <w:p>
@@ -3004,7 +3004,7 @@
         <w:t xml:space="preserve">Where in the app: </w:t>
       </w:r>
       <w:r>
-        <w:t>Open any daily log &gt; "Copy to dates" button.</w:t>
+        <w:t>Daily-log form &gt; "Add another movement"; check in Reports &gt; Diary / TA Journal.</w:t>
       </w:r>
     </w:p>
     <w:p>
@@ -3018,7 +3018,7 @@
         <w:t xml:space="preserve">How to check: </w:t>
       </w:r>
       <w:r>
-        <w:t>Tap Copy to dates, pick the new dates on the month grid: each picked date gets its own copy of the entry; the original stays untouched.</w:t>
+        <w:t>Add a normal station stop, then choose Footplate as the next stop and fill its boarding / other-end / Day / Night / trains: the export shows the road legs plus the footplate legs, one per ride.</w:t>
       </w:r>
     </w:p>
     <w:p>
@@ -3026,7 +3026,7 @@
         <w:pStyle w:val="ListBullet"/>
       </w:pPr>
       <w:r>
-        <w:t>If one day's PCDO visit covered more than one station, you can now add one card per station to the same daily log - each with its own special work, disconnections and counter resets - instead of mixing everything under one station.</w:t>
+        <w:t>In Reports, you can now tap any line in a list (for example the list of daily logs or of total TA) and the app opens that exact day's entry. Pressing Back takes you straight back to the same list instead of jumping to Home.</w:t>
       </w:r>
     </w:p>
     <w:p>
@@ -3040,7 +3040,7 @@
         <w:t xml:space="preserve">Where in the app: </w:t>
       </w:r>
       <w:r>
-        <w:t>Daily-log form &gt; tick PCDO &gt; "+ Add station".</w:t>
+        <w:t>Reports tab - any list that shows entries.</w:t>
       </w:r>
     </w:p>
     <w:p>
@@ -3054,7 +3054,7 @@
         <w:t xml:space="preserve">How to check: </w:t>
       </w:r>
       <w:r>
-        <w:t>Fill the first station's card, tap + Add station, fill the second: the PCDO export and Reports group each card under its own station.</w:t>
+        <w:t>Tap a row, read the entry, press Back: you are back on the list you started from.</w:t>
       </w:r>
     </w:p>
     <w:p>
@@ -3062,7 +3062,7 @@
         <w:pStyle w:val="ListBullet"/>
       </w:pPr>
       <w:r>
-        <w:t>You can choose the letter style of the whole app - for example a handwritten or a book-style face - and the choice works without internet and survives backups.</w:t>
+        <w:t>Some checks must be done on one particular side of a station (for example "towards the ALVARPET side"). The app now remembers each side separately, so finishing one side does not finish the other: each side gets its own "last done" date and its own warning when it is due.</w:t>
       </w:r>
     </w:p>
     <w:p>
@@ -3076,7 +3076,7 @@
         <w:t xml:space="preserve">Where in the app: </w:t>
       </w:r>
       <w:r>
-        <w:t>Settings &gt; Appearance &gt; Font style.</w:t>
+        <w:t>Daily-log form &gt; Tags that ask "towards which side?"; Settings &gt; Notifications; Reports &gt; Inspection Schedule.</w:t>
       </w:r>
     </w:p>
     <w:p>
@@ -3090,7 +3090,7 @@
         <w:t xml:space="preserve">How to check: </w:t>
       </w:r>
       <w:r>
-        <w:t>Pick one of the seven faces (System, Delius, Patrick Hand, Nunito, Caveat, Atkinson, Literata): the whole app immediately re-renders in that font.</w:t>
+        <w:t>Do one side on Monday and the other on Friday: in the Inspection Schedule both sides show their own last-done and next-due dates, and each warns on its own count-down.</w:t>
       </w:r>
     </w:p>
     <w:p>
@@ -3098,7 +3098,7 @@
         <w:pStyle w:val="ListBullet"/>
       </w:pPr>
       <w:r>
-        <w:t>The Home calendar was rebuilt: you can swipe smoothly between months - the next month visibly slides in - with rounded day cells, a blue gradient for today, a green gradient for selected dates, and a spring-back effect when you do not swipe far enough.</w:t>
+        <w:t>On Home, a date in the bottom list that has no entry yet shows a blue "No entry - tap to add" line. Tapping that date opens a ready-to-fill form for exactly that date.</w:t>
       </w:r>
     </w:p>
     <w:p>
@@ -3112,7 +3112,7 @@
         <w:t xml:space="preserve">Where in the app: </w:t>
       </w:r>
       <w:r>
-        <w:t>Home tab &gt; calendar above the daily-log cards.</w:t>
+        <w:t>Home tab &gt; the date cards in the bottom timeline.</w:t>
       </w:r>
     </w:p>
     <w:p>
@@ -3126,7 +3126,7 @@
         <w:t xml:space="preserve">How to check: </w:t>
       </w:r>
       <w:r>
-        <w:t>Swipe left / right: months slide in smoothly; a weak swipe springs back to the middle month; today is a blue gradient and selected days are green.</w:t>
+        <w:t>Tap an empty date card: the Add Daily Log form opens with that date already filled in; saving files the entry on that same date.</w:t>
       </w:r>
     </w:p>
     <w:p>
@@ -3134,7 +3134,7 @@
         <w:pStyle w:val="ListBullet"/>
       </w:pPr>
       <w:r>
-        <w:t>The Attachments screen got the same modern card look as Notes and Home; the About page now calls the Telegram / WhatsApp links "S&amp;T manuals groups"; and Appearance gained three new colour themes (Forest, Midnight, Rose) and three new fonts (Lexend, IBM Plex, Merriweather).</w:t>
+        <w:t>In the personal build you can ask your AI model to make a printed report prettier: it picks the colours, column widths, row shading and borders for Colour PDF / Word reports. If the AI cannot be reached, the report simply prints in the normal standard look, so nothing ever fails.</w:t>
       </w:r>
     </w:p>
     <w:p>
@@ -3148,7 +3148,7 @@
         <w:t xml:space="preserve">Where in the app: </w:t>
       </w:r>
       <w:r>
-        <w:t>Attachments tab; Settings &gt; About; Settings &gt; Appearance.</w:t>
+        <w:t>Settings &gt; AI Export tab (personal build).</w:t>
       </w:r>
     </w:p>
     <w:p>
@@ -3162,7 +3162,7 @@
         <w:t xml:space="preserve">How to check: </w:t>
       </w:r>
       <w:r>
-        <w:t>Open Attachments to see the new search bar, filter chips and striped cards; read the About groups for the manuals wording; pick a new theme or font in Appearance and watch the app re-skin.</w:t>
+        <w:t>Turn the switch on, test the connection, then generate a Colour PDF: the layout looks AI-styled. Turn the AI off (or break the connection) and the same report falls back to the standard look.</w:t>
       </w:r>
     </w:p>
     <w:p>
@@ -3170,7 +3170,7 @@
         <w:pStyle w:val="ListBullet"/>
       </w:pPr>
       <w:r>
-        <w:t>Appearance gained eight new colour themes - Butter, Champagne, Dragonfruit, Spark, Ultra, Vanilla, Neon and Lilac. Each theme is a colour pair for the whole app, so picking one instantly re-skins everything while buttons, chips and labels stay easy to read.</w:t>
+        <w:t>When logging a move to a station you rarely visit, you can type that station's name just for this one day instead of adding it permanently to your stations list - it shows in the log and the printed reports, but your saved list stays clean.</w:t>
       </w:r>
     </w:p>
     <w:p>
@@ -3184,7 +3184,7 @@
         <w:t xml:space="preserve">Where in the app: </w:t>
       </w:r>
       <w:r>
-        <w:t>Settings &gt; Appearance &gt; Themes.</w:t>
+        <w:t>Daily-log form &gt; Station / Movement &gt; "Temporary station...".</w:t>
       </w:r>
     </w:p>
     <w:p>
@@ -3198,7 +3198,7 @@
         <w:t xml:space="preserve">How to check: </w:t>
       </w:r>
       <w:r>
-        <w:t>Pick a new theme, say Neon: the app's colours change everywhere at once, and the status tints and text stay readable on top of it.</w:t>
+        <w:t>Type a one-day station name and save: it reappears when you open the log and shows in Home / Reports / print, but Settings &gt; Stations has no new entry.</w:t>
       </w:r>
     </w:p>
     <w:p>
@@ -3206,7 +3206,7 @@
         <w:pStyle w:val="ListBullet"/>
       </w:pPr>
       <w:r>
-        <w:t>Printed colour reports - PDF or Word, every report type - now share one modern look: dark indigo title bands and table headers with white text, a teal accent line, softly striped rows and a tinted Total row. If you prefer the plain (no colour) or Excel reports, those look exactly as before.</w:t>
+        <w:t>On days that repeat a previous day's work, you can copy an entire daily log to one or more other dates in a few taps - same movement, same work, same timings, tags and photos - and edit each copy separately.</w:t>
       </w:r>
     </w:p>
     <w:p>
@@ -3220,7 +3220,7 @@
         <w:t xml:space="preserve">Where in the app: </w:t>
       </w:r>
       <w:r>
-        <w:t>Reports &gt; Generate, the Colour PDF / Word options.</w:t>
+        <w:t>Open any daily log &gt; "Copy to dates" button.</w:t>
       </w:r>
     </w:p>
     <w:p>
@@ -3234,7 +3234,7 @@
         <w:t xml:space="preserve">How to check: </w:t>
       </w:r>
       <w:r>
-        <w:t>Generate any colour report: the heading band is deep indigo with white text, a teal rule sits under it, rows alternate softly and the Total row is tinted. Plain and Excel exports are untouched.</w:t>
+        <w:t>Tap Copy to dates, pick the new dates on the month grid: each picked date gets its own copy of the entry; the original stays untouched.</w:t>
       </w:r>
     </w:p>
     <w:p>
@@ -3242,7 +3242,7 @@
         <w:pStyle w:val="ListBullet"/>
       </w:pPr>
       <w:r>
-        <w:t>The app got a subtle 3-D polish: the main buttons and tiles now sit raised with a soft shadow in every theme, the Home calendar casts a little ledge shadow over the list below, and the calendar's green highlight now lines up exactly with the list you are scrolling - on any date, month or screen size.</w:t>
+        <w:t>If one day's PCDO visit covered more than one station, you can now add one card per station to the same daily log - each with its own special work, disconnections and counter resets - instead of mixing everything under one station.</w:t>
       </w:r>
     </w:p>
     <w:p>
@@ -3256,7 +3256,7 @@
         <w:t xml:space="preserve">Where in the app: </w:t>
       </w:r>
       <w:r>
-        <w:t>Home tab: the calendar and the timeline under it; the raised tiles in Reports, Settings, Tasks, Attachments and Search.</w:t>
+        <w:t>Daily-log form &gt; tick PCDO &gt; "+ Add station".</w:t>
       </w:r>
     </w:p>
     <w:p>
@@ -3270,7 +3270,7 @@
         <w:t xml:space="preserve">How to check: </w:t>
       </w:r>
       <w:r>
-        <w:t>Scroll the Home list slowly: the green highlight on the calendar switches from the upper log card to the lower one exactly when the calendar's bottom edge crosses the middle of the gap between the two cards; Today and the selected buttons sit raised with a shadow.</w:t>
+        <w:t>Fill the first station's card, tap + Add station, fill the second: the PCDO export and Reports group each card under its own station.</w:t>
       </w:r>
     </w:p>
     <w:p>
@@ -3278,7 +3278,7 @@
         <w:pStyle w:val="ListBullet"/>
       </w:pPr>
       <w:r>
-        <w:t>While you are filling in a daily log and have turned on Edit the rows, a live Diary preview of just that day's entry now sits under the editor. It shows the DATE / TRAIN NO / TIME DEP / TIME ARR / FROM / TO / NATURE OF WORK lines exactly as they will print, and it updates as you change each travel line - so you can see the printed look before you generate the report.</w:t>
+        <w:t>You can choose the letter style of the whole app - for example a handwritten or a book-style face - and the choice works without internet and survives backups.</w:t>
       </w:r>
     </w:p>
     <w:p>
@@ -3292,7 +3292,7 @@
         <w:t xml:space="preserve">Where in the app: </w:t>
       </w:r>
       <w:r>
-        <w:t>Daily-log form &gt; "Edit the rows" (or two-or-more movements, which open the editor automatically).</w:t>
+        <w:t>Settings &gt; Appearance &gt; Font style.</w:t>
       </w:r>
     </w:p>
     <w:p>
@@ -3306,7 +3306,259 @@
         <w:t xml:space="preserve">How to check: </w:t>
       </w:r>
       <w:r>
+        <w:t>Pick one of the seven faces (System, Delius, Patrick Hand, Nunito, Caveat, Atkinson, Literata): the whole app immediately re-renders in that font.</w:t>
+      </w:r>
+    </w:p>
+    <w:p>
+      <w:pPr>
+        <w:pStyle w:val="ListBullet"/>
+      </w:pPr>
+      <w:r>
+        <w:t>The Home calendar was rebuilt: you can swipe smoothly between months - the next month visibly slides in - with rounded day cells, a blue gradient for today, a green gradient for selected dates, and a spring-back effect when you do not swipe far enough.</w:t>
+      </w:r>
+    </w:p>
+    <w:p>
+      <w:pPr>
+        <w:pStyle w:val="ListBullet2"/>
+      </w:pPr>
+      <w:r>
+        <w:rPr>
+          <w:b/>
+        </w:rPr>
+        <w:t xml:space="preserve">Where in the app: </w:t>
+      </w:r>
+      <w:r>
+        <w:t>Home tab &gt; calendar above the daily-log cards.</w:t>
+      </w:r>
+    </w:p>
+    <w:p>
+      <w:pPr>
+        <w:pStyle w:val="ListBullet2"/>
+      </w:pPr>
+      <w:r>
+        <w:rPr>
+          <w:b/>
+        </w:rPr>
+        <w:t xml:space="preserve">How to check: </w:t>
+      </w:r>
+      <w:r>
+        <w:t>Swipe left / right: months slide in smoothly; a weak swipe springs back to the middle month; today is a blue gradient and selected days are green.</w:t>
+      </w:r>
+    </w:p>
+    <w:p>
+      <w:pPr>
+        <w:pStyle w:val="ListBullet"/>
+      </w:pPr>
+      <w:r>
+        <w:t>The Attachments screen got the same modern card look as Notes and Home; the About page now calls the Telegram / WhatsApp links "S&amp;T manuals groups"; and Appearance gained three new colour themes (Forest, Midnight, Rose) and three new fonts (Lexend, IBM Plex, Merriweather).</w:t>
+      </w:r>
+    </w:p>
+    <w:p>
+      <w:pPr>
+        <w:pStyle w:val="ListBullet2"/>
+      </w:pPr>
+      <w:r>
+        <w:rPr>
+          <w:b/>
+        </w:rPr>
+        <w:t xml:space="preserve">Where in the app: </w:t>
+      </w:r>
+      <w:r>
+        <w:t>Attachments tab; Settings &gt; About; Settings &gt; Appearance.</w:t>
+      </w:r>
+    </w:p>
+    <w:p>
+      <w:pPr>
+        <w:pStyle w:val="ListBullet2"/>
+      </w:pPr>
+      <w:r>
+        <w:rPr>
+          <w:b/>
+        </w:rPr>
+        <w:t xml:space="preserve">How to check: </w:t>
+      </w:r>
+      <w:r>
+        <w:t>Open Attachments to see the new search bar, filter chips and striped cards; read the About groups for the manuals wording; pick a new theme or font in Appearance and watch the app re-skin.</w:t>
+      </w:r>
+    </w:p>
+    <w:p>
+      <w:pPr>
+        <w:pStyle w:val="ListBullet"/>
+      </w:pPr>
+      <w:r>
+        <w:t>Appearance gained eight new colour themes - Butter, Champagne, Dragonfruit, Spark, Ultra, Vanilla, Neon and Lilac. Each theme is a colour pair for the whole app, so picking one instantly re-skins everything while buttons, chips and labels stay easy to read.</w:t>
+      </w:r>
+    </w:p>
+    <w:p>
+      <w:pPr>
+        <w:pStyle w:val="ListBullet2"/>
+      </w:pPr>
+      <w:r>
+        <w:rPr>
+          <w:b/>
+        </w:rPr>
+        <w:t xml:space="preserve">Where in the app: </w:t>
+      </w:r>
+      <w:r>
+        <w:t>Settings &gt; Appearance &gt; Themes.</w:t>
+      </w:r>
+    </w:p>
+    <w:p>
+      <w:pPr>
+        <w:pStyle w:val="ListBullet2"/>
+      </w:pPr>
+      <w:r>
+        <w:rPr>
+          <w:b/>
+        </w:rPr>
+        <w:t xml:space="preserve">How to check: </w:t>
+      </w:r>
+      <w:r>
+        <w:t>Pick a new theme, say Neon: the app's colours change everywhere at once, and the status tints and text stay readable on top of it.</w:t>
+      </w:r>
+    </w:p>
+    <w:p>
+      <w:pPr>
+        <w:pStyle w:val="ListBullet"/>
+      </w:pPr>
+      <w:r>
+        <w:t>Printed colour reports - PDF or Word, every report type - now share one modern look: dark indigo title bands and table headers with white text, a teal accent line, softly striped rows and a tinted Total row. If you prefer the plain (no colour) or Excel reports, those look exactly as before.</w:t>
+      </w:r>
+    </w:p>
+    <w:p>
+      <w:pPr>
+        <w:pStyle w:val="ListBullet2"/>
+      </w:pPr>
+      <w:r>
+        <w:rPr>
+          <w:b/>
+        </w:rPr>
+        <w:t xml:space="preserve">Where in the app: </w:t>
+      </w:r>
+      <w:r>
+        <w:t>Reports &gt; Generate, the Colour PDF / Word options.</w:t>
+      </w:r>
+    </w:p>
+    <w:p>
+      <w:pPr>
+        <w:pStyle w:val="ListBullet2"/>
+      </w:pPr>
+      <w:r>
+        <w:rPr>
+          <w:b/>
+        </w:rPr>
+        <w:t xml:space="preserve">How to check: </w:t>
+      </w:r>
+      <w:r>
+        <w:t>Generate any colour report: the heading band is deep indigo with white text, a teal rule sits under it, rows alternate softly and the Total row is tinted. Plain and Excel exports are untouched.</w:t>
+      </w:r>
+    </w:p>
+    <w:p>
+      <w:pPr>
+        <w:pStyle w:val="ListBullet"/>
+      </w:pPr>
+      <w:r>
+        <w:t>The app got a subtle 3-D polish: the main buttons and tiles now sit raised with a soft shadow in every theme, the Home calendar casts a little ledge shadow over the list below, and the calendar's green highlight now lines up exactly with the list you are scrolling - on any date, month or screen size.</w:t>
+      </w:r>
+    </w:p>
+    <w:p>
+      <w:pPr>
+        <w:pStyle w:val="ListBullet2"/>
+      </w:pPr>
+      <w:r>
+        <w:rPr>
+          <w:b/>
+        </w:rPr>
+        <w:t xml:space="preserve">Where in the app: </w:t>
+      </w:r>
+      <w:r>
+        <w:t>Home tab: the calendar and the timeline under it; the raised tiles in Reports, Settings, Tasks, Attachments and Search.</w:t>
+      </w:r>
+    </w:p>
+    <w:p>
+      <w:pPr>
+        <w:pStyle w:val="ListBullet2"/>
+      </w:pPr>
+      <w:r>
+        <w:rPr>
+          <w:b/>
+        </w:rPr>
+        <w:t xml:space="preserve">How to check: </w:t>
+      </w:r>
+      <w:r>
+        <w:t>Scroll the Home list slowly: the green highlight on the calendar switches from the upper log card to the lower one exactly when the calendar's bottom edge crosses the middle of the gap between the two cards; Today and the selected buttons sit raised with a shadow.</w:t>
+      </w:r>
+    </w:p>
+    <w:p>
+      <w:pPr>
+        <w:pStyle w:val="ListBullet"/>
+      </w:pPr>
+      <w:r>
+        <w:t>While you are filling in a daily log and have turned on Edit the rows, a live Diary preview of just that day's entry now sits under the editor. It shows the DATE / TRAIN NO / TIME DEP / TIME ARR / FROM / TO / NATURE OF WORK lines exactly as they will print, and it updates as you change each travel line - so you can see the printed look before you generate the report.</w:t>
+      </w:r>
+    </w:p>
+    <w:p>
+      <w:pPr>
+        <w:pStyle w:val="ListBullet2"/>
+      </w:pPr>
+      <w:r>
+        <w:rPr>
+          <w:b/>
+        </w:rPr>
+        <w:t xml:space="preserve">Where in the app: </w:t>
+      </w:r>
+      <w:r>
+        <w:t>Daily-log form &gt; "Edit the rows" (or two-or-more movements, which open the editor automatically).</w:t>
+      </w:r>
+    </w:p>
+    <w:p>
+      <w:pPr>
+        <w:pStyle w:val="ListBullet2"/>
+      </w:pPr>
+      <w:r>
+        <w:rPr>
+          <w:b/>
+        </w:rPr>
+        <w:t xml:space="preserve">How to check: </w:t>
+      </w:r>
+      <w:r>
         <w:t>Open a daily log, turn on Edit the rows, change a From / To or a time: the preview table under the editor updates at once, and those same values appear in the generated Diary PDF / Word.</w:t>
+      </w:r>
+    </w:p>
+    <w:p>
+      <w:pPr>
+        <w:pStyle w:val="ListBullet"/>
+      </w:pPr>
+      <w:r>
+        <w:t>The app can now print your Muster - the monthly attendance sheet - straight from your daily logs, so you no longer copy day codes into a sheet by hand. You pick the muster month and it lays out the 11th to the 10th as the two half-rows of days, and each day reads its own letter from that day's log: OL if the day's travel was TA-claimed, P for any other logged day, REST / NH / CR from those entries, and PL / CL / SICK from your leave entries; days you never logged stay blank.</w:t>
+      </w:r>
+    </w:p>
+    <w:p>
+      <w:pPr>
+        <w:pStyle w:val="ListBullet2"/>
+      </w:pPr>
+      <w:r>
+        <w:rPr>
+          <w:b/>
+        </w:rPr>
+        <w:t xml:space="preserve">Where in the app: </w:t>
+      </w:r>
+      <w:r>
+        <w:t>Reports &gt; Generate Reports (or the top-bar Export menu) &gt; "Export Muster"; the header comes from Settings &gt; My Profile, including the new Office field.</w:t>
+      </w:r>
+    </w:p>
+    <w:p>
+      <w:pPr>
+        <w:pStyle w:val="ListBullet2"/>
+      </w:pPr>
+      <w:r>
+        <w:rPr>
+          <w:b/>
+        </w:rPr>
+        <w:t xml:space="preserve">How to check: </w:t>
+      </w:r>
+      <w:r>
+        <w:t>Set your Office in My Profile (for example SSE/SIG/O/JMDG), then export the muster for a month as PDF: your zone, Office, PF No, name and designation with the HQ station print in the header, AMC NO / DMC NO print as --- to fill in, and each day's letter matches that day's log. Also available as Word and Excel, in Colour or Plain.</w:t>
       </w:r>
     </w:p>
     <w:sectPr>

</xml_diff>